<commit_message>
Simplifica documentação da adaptação do algoritmo genético
</commit_message>
<xml_diff>
--- a/Tech_Challenge_Fase2_Entrega.docx
+++ b/Tech_Challenge_Fase2_Entrega.docx
@@ -952,12 +952,7 @@
         <w:pStyle w:val="Heading1"/>
       </w:pPr>
       <w:r>
-        <w:t>3 Evolução da base FIAP</w:t>
-      </w:r>
-    </w:p>
-    <w:p>
-      <w:r>
-        <w:t>Preservamos a base FIAP no commit d236a2ae6a08fefdb8ee9f1ca3f8201223a92da3. Os arquivos originais e seus hashes permitem conferir a origem. O arquivo LICENSE declara CC0 1.0, embora o README mencione MIT; registramos essa divergência sem substituir a licença presente no commit.</w:t>
+        <w:t>3 Adaptação do algoritmo genético</w:t>
       </w:r>
     </w:p>
     <w:tbl>

</xml_diff>

<commit_message>
Explica os métodos de comparação no relatório e no roteiro
</commit_message>
<xml_diff>
--- a/Tech_Challenge_Fase2_Entrega.docx
+++ b/Tech_Challenge_Fase2_Entrega.docx
@@ -1500,6 +1500,29 @@
     <w:p>
       <w:r>
         <w:t>A reprodução da referência remove apenas a dependência gráfica e mantém seus operadores, probabilidade de mutação 0,50, um elite e crossover com o mesmo pai. Essa comparação é restrita ao TSP de 15 pontos compatível com a fonte.</w:t>
+      </w:r>
+    </w:p>
+    <w:p>
+      <w:pPr>
+        <w:pStyle w:val="Heading2"/>
+      </w:pPr>
+      <w:r>
+        <w:t>Significado dos métodos nos resultados</w:t>
+      </w:r>
+    </w:p>
+    <w:p>
+      <w:r>
+        <w:t>Guloso é uma heurística que insere cada entrega na posição de menor custo imediato, considerando primeiro as restrições. Comparamos três construções, ordenadas por prioridade, carga ou proximidade, e aplicamos reparação. É a referência simples de construção de rotas.</w:t>
+      </w:r>
+    </w:p>
+    <w:p>
+      <w:r>
+        <w:t>OR-Tools é a biblioteca de otimização do Google. Seu solucionador de roteamento constrói uma solução inicial e procura melhorias por busca local guiada, respeitando capacidade e autonomia. Usamos cinco segundos por execução como referência de comparação.</w:t>
+      </w:r>
+    </w:p>
+    <w:p>
+      <w:r>
+        <w:t>GA é a sigla de Genetic Algorithm, ou algoritmo genético: uma população de soluções evolui por seleção, cruzamento e mutação. O rótulo GA selecionado identifica a configuração escolhida nos cenários de desenvolvimento: 80 indivíduos e probabilidade de mutação de 10% por descendente. A escolha antecede a avaliação final e não significa superioridade sobre os comparadores.</w:t>
       </w:r>
     </w:p>
     <w:p>

</xml_diff>

<commit_message>
Corrige a visualização da evolução e documenta as interrupções
</commit_message>
<xml_diff>
--- a/Tech_Challenge_Fase2_Entrega.docx
+++ b/Tech_Challenge_Fase2_Entrega.docx
@@ -3533,12 +3533,17 @@
         <w:pStyle w:val="Caption"/>
       </w:pPr>
       <w:r>
-        <w:t>Figura 2  Melhor J viável observado e interrupções antes de completar gerações.</w:t>
+        <w:t>Figura 2  Evolução registrada e observações inicial/final. Marcadores distintos conservam os valores sobrepostos; pontos sem gerações não comprovam convergência.</w:t>
       </w:r>
     </w:p>
     <w:p>
       <w:r>
-        <w:t>Nos cenários maiores, a reparação avalia numerosas inserções e trocas. Ao contabilizar esse custo dentro das 20 mil chamadas, parte das execuções termina durante a inicialização. Um ponto isolado no gráfico indica esse término e não deve ser apresentado como convergência de um processo evolutivo completo.</w:t>
+        <w:t>A reparação tenta corrigir rotas que excedem capacidade ou autonomia, transferindo ou trocando entregas entre veículos. Ela preserva as visitas, mas pode falhar. A implementação avalia muitas alternativas; esse custo entra no teto de 20 mil avaliações e pode interromper a própria busca genética.</w:t>
+      </w:r>
+    </w:p>
+    <w:p>
+      <w:r>
+        <w:t>Na semente 42 com 30 entregas, 80/10% registra 38 gerações. A configuração 160/20% avalia a população inicial, mas não completa uma geração seguinte: seus registros inicial e final aparecem como quadrados laranja, sem curva de evolução. A configuração 240/30% interrompe a inicialização. Com 60 entregas, as três interrompem essa etapa e retornam o mesmo J; círculo, quadrado e cruz permanecem na coordenada real. A aprovação dos testes dos operadores não demonstra otimização eficaz nesses casos.</w:t>
       </w:r>
     </w:p>
     <w:tbl>
@@ -3684,12 +3689,12 @@
     </w:p>
     <w:p>
       <w:r>
-        <w:t>O limite de tentativas encerra a busca quando a população repete candidatos, mesmo que a quantidade de chamadas novas de fitness seja menor que 20 mil. Esse encerramento evita interpretar cache como processamento adicional. A melhor solução viável já avaliada é conservada quando o orçamento termina em qualquer etapa.</w:t>
+        <w:t>O limite de tentativas encerra a busca quando há repetição de candidatos, mesmo com menos de 20 mil avaliações novas. Tentativas com resultados em cache são contadas separadamente. Ao atingir qualquer limite, conservamos a melhor solução viável já avaliada.</w:t>
       </w:r>
     </w:p>
     <w:p>
       <w:r>
-        <w:t>A conclusão é que a reparação implementada funciona como mecanismo de preservação de restrições, mas é cara para este orçamento. Uma reparação incremental, candidatos de inserção mais seletivos e construção inicial com melhor diversidade são propostas de melhoria. Elas exigiriam nova avaliação; não atribuímos ganhos a versões ainda não testadas.</w:t>
+        <w:t>A reparação preserva restrições, mas seu custo limita o algoritmo neste orçamento. Avaliar essa abordagem nas escalas maiores exige tornar a inicialização e a reparação mais eficientes e repetir os experimentos. Não atribuímos ganhos a melhorias ainda não testadas.</w:t>
       </w:r>
     </w:p>
     <w:p>

</xml_diff>